<commit_message>
BT02: Them trang bia co logo SGU va khung vien
</commit_message>
<xml_diff>
--- a/BT02_ComputationGraph/BT02_ComputationGraph_VoTuongLong_3123580023.docx
+++ b/BT02_ComputationGraph/BT02_ComputationGraph_VoTuongLong_3123580023.docx
@@ -2,20 +2,46 @@
 <file path=word/document.xml><?xml version="1.0" encoding="utf-8"?>
 <w:document xmlns:wpc="http://schemas.microsoft.com/office/word/2010/wordprocessingCanvas" xmlns:mo="http://schemas.microsoft.com/office/mac/office/2008/main" xmlns:mc="http://schemas.openxmlformats.org/markup-compatibility/2006" xmlns:mv="urn:schemas-microsoft-com:mac:vml" xmlns:o="urn:schemas-microsoft-com:office:office" xmlns:r="http://schemas.openxmlformats.org/officeDocument/2006/relationships" xmlns:m="http://schemas.openxmlformats.org/officeDocument/2006/math" xmlns:v="urn:schemas-microsoft-com:vml" xmlns:wp14="http://schemas.microsoft.com/office/word/2010/wordprocessingDrawing" xmlns:wp="http://schemas.openxmlformats.org/drawingml/2006/wordprocessingDrawing" xmlns:w10="urn:schemas-microsoft-com:office:word" xmlns:w="http://schemas.openxmlformats.org/wordprocessingml/2006/main" xmlns:w14="http://schemas.microsoft.com/office/word/2010/wordml" xmlns:wpg="http://schemas.microsoft.com/office/word/2010/wordprocessingGroup" xmlns:wpi="http://schemas.microsoft.com/office/word/2010/wordprocessingInk" xmlns:wne="http://schemas.microsoft.com/office/word/2006/wordml" xmlns:wps="http://schemas.microsoft.com/office/word/2010/wordprocessingShape" mc:Ignorable="w14 wp14">
   <w:body>
-    <w:p/>
-    <w:p/>
-    <w:p/>
     <w:p>
       <w:pPr>
+        <w:spacing w:before="0" w:after="40" w:line="240" w:lineRule="auto"/>
         <w:jc w:val="center"/>
       </w:pPr>
       <w:r>
         <w:rPr>
           <w:b/>
           <w:i w:val="0"/>
-          <w:sz w:val="44"/>
+          <w:sz w:val="30"/>
         </w:rPr>
-        <w:t>BÁO CÁO BÀI TẬP</w:t>
+        <w:t>TRƯỜNG ĐẠI HỌC SÀI GÒN</w:t>
+      </w:r>
+    </w:p>
+    <w:p>
+      <w:pPr>
+        <w:spacing w:before="0" w:after="0" w:line="240" w:lineRule="auto"/>
+        <w:jc w:val="center"/>
+      </w:pPr>
+      <w:r>
+        <w:rPr>
+          <w:b/>
+          <w:i w:val="0"/>
+          <w:sz w:val="28"/>
+        </w:rPr>
+        <w:t>KHOA CÔNG NGHỆ THÔNG TIN</w:t>
+      </w:r>
+    </w:p>
+    <w:p>
+      <w:pPr>
+        <w:spacing w:before="0" w:after="360" w:line="240" w:lineRule="auto"/>
+        <w:jc w:val="center"/>
+      </w:pPr>
+      <w:r>
+        <w:rPr>
+          <w:b w:val="0"/>
+          <w:i w:val="0"/>
+          <w:sz w:val="24"/>
+        </w:rPr>
+        <w:t>──────── o0o ────────</w:t>
       </w:r>
     </w:p>
     <w:p>
@@ -23,30 +49,71 @@
         <w:jc w:val="center"/>
       </w:pPr>
       <w:r>
-        <w:rPr>
-          <w:b/>
-          <w:i w:val="0"/>
-          <w:sz w:val="32"/>
-        </w:rPr>
-        <w:t>MÔN HỌC: HỌC SÂU (DEEP LEARNING)</w:t>
+        <w:drawing>
+          <wp:inline xmlns:a="http://schemas.openxmlformats.org/drawingml/2006/main" xmlns:pic="http://schemas.openxmlformats.org/drawingml/2006/picture">
+            <wp:extent cx="1800000" cy="1800000"/>
+            <wp:docPr id="1" name="Picture 1"/>
+            <wp:cNvGraphicFramePr>
+              <a:graphicFrameLocks noChangeAspect="1"/>
+            </wp:cNvGraphicFramePr>
+            <a:graphic>
+              <a:graphicData uri="http://schemas.openxmlformats.org/drawingml/2006/picture">
+                <pic:pic>
+                  <pic:nvPicPr>
+                    <pic:cNvPr id="0" name="logoSGU_cat.png"/>
+                    <pic:cNvPicPr/>
+                  </pic:nvPicPr>
+                  <pic:blipFill>
+                    <a:blip r:embed="rId10"/>
+                    <a:stretch>
+                      <a:fillRect/>
+                    </a:stretch>
+                  </pic:blipFill>
+                  <pic:spPr>
+                    <a:xfrm>
+                      <a:off x="0" y="0"/>
+                      <a:ext cx="1800000" cy="1800000"/>
+                    </a:xfrm>
+                    <a:prstGeom prst="rect"/>
+                  </pic:spPr>
+                </pic:pic>
+              </a:graphicData>
+            </a:graphic>
+          </wp:inline>
+        </w:drawing>
       </w:r>
     </w:p>
-    <w:p/>
     <w:p>
       <w:pPr>
+        <w:spacing w:before="480" w:after="480" w:line="240" w:lineRule="auto"/>
         <w:jc w:val="center"/>
       </w:pPr>
       <w:r>
         <w:rPr>
           <w:b/>
           <w:i w:val="0"/>
-          <w:sz w:val="36"/>
+          <w:sz w:val="30"/>
         </w:rPr>
-        <w:t>BÀI TẬP 02</w:t>
+        <w:t>MÔN HỌC: HỌC SÂU (DEEP LEARNING)</w:t>
       </w:r>
     </w:p>
     <w:p>
       <w:pPr>
+        <w:spacing w:before="0" w:after="160" w:line="240" w:lineRule="auto"/>
+        <w:jc w:val="center"/>
+      </w:pPr>
+      <w:r>
+        <w:rPr>
+          <w:b/>
+          <w:i w:val="0"/>
+          <w:sz w:val="40"/>
+        </w:rPr>
+        <w:t>BÁO CÁO BÀI TẬP 02</w:t>
+      </w:r>
+    </w:p>
+    <w:p>
+      <w:pPr>
+        <w:spacing w:before="0" w:after="0" w:line="240" w:lineRule="auto"/>
         <w:jc w:val="center"/>
       </w:pPr>
       <w:r>
@@ -54,13 +121,29 @@
           <w:b/>
           <w:i w:val="0"/>
           <w:color w:val="0D47A1"/>
-          <w:sz w:val="40"/>
+          <w:sz w:val="48"/>
         </w:rPr>
-        <w:t>HỒI QUY LOGISTIC VÀ ĐỒ THỊ TÍNH TOÁN</w:t>
+        <w:t>HỒI QUY LOGISTIC</w:t>
       </w:r>
     </w:p>
     <w:p>
       <w:pPr>
+        <w:spacing w:before="0" w:after="120" w:line="240" w:lineRule="auto"/>
+        <w:jc w:val="center"/>
+      </w:pPr>
+      <w:r>
+        <w:rPr>
+          <w:b/>
+          <w:i w:val="0"/>
+          <w:color w:val="0D47A1"/>
+          <w:sz w:val="48"/>
+        </w:rPr>
+        <w:t>VÀ ĐỒ THỊ TÍNH TOÁN</w:t>
+      </w:r>
+    </w:p>
+    <w:p>
+      <w:pPr>
+        <w:spacing w:before="0" w:after="1600" w:line="240" w:lineRule="auto"/>
         <w:jc w:val="center"/>
       </w:pPr>
       <w:r>
@@ -72,11 +155,6 @@
         <w:t>(Logistic Regression &amp; Computation Graph)</w:t>
       </w:r>
     </w:p>
-    <w:p/>
-    <w:p/>
-    <w:p/>
-    <w:p/>
-    <w:p/>
     <w:tbl>
       <w:tblPr>
         <w:tblW w:type="auto" w:w="0"/>
@@ -90,7 +168,7 @@
       <w:tr>
         <w:tc>
           <w:tcPr>
-            <w:tcW w:type="dxa" w:w="3118"/>
+            <w:tcW w:type="dxa" w:w="2835"/>
           </w:tcPr>
           <w:p>
             <w:r/>
@@ -99,7 +177,7 @@
                 <w:b/>
                 <w:sz w:val="28"/>
               </w:rPr>
-              <w:t>Họ và tên sinh viên:</w:t>
+              <w:t>Sinh viên thực hiện:</w:t>
             </w:r>
           </w:p>
         </w:tc>
@@ -111,6 +189,7 @@
             <w:r/>
             <w:r>
               <w:rPr>
+                <w:b/>
                 <w:sz w:val="28"/>
               </w:rPr>
               <w:t>Võ Tường Long</w:t>
@@ -121,7 +200,7 @@
       <w:tr>
         <w:tc>
           <w:tcPr>
-            <w:tcW w:type="dxa" w:w="3118"/>
+            <w:tcW w:type="dxa" w:w="2835"/>
           </w:tcPr>
           <w:p>
             <w:r/>
@@ -142,6 +221,7 @@
             <w:r/>
             <w:r>
               <w:rPr>
+                <w:b w:val="0"/>
                 <w:sz w:val="28"/>
               </w:rPr>
               <w:t>3123580023</w:t>
@@ -152,7 +232,7 @@
       <w:tr>
         <w:tc>
           <w:tcPr>
-            <w:tcW w:type="dxa" w:w="3118"/>
+            <w:tcW w:type="dxa" w:w="2835"/>
           </w:tcPr>
           <w:p>
             <w:r/>
@@ -173,7 +253,8 @@
             <w:r/>
             <w:r>
               <w:rPr>
-                <w:sz w:val="28"/>
+                <w:b w:val="0"/>
+                <w:sz w:val="24"/>
               </w:rPr>
               <w:t>github.com/tuonglong1012/Mon_Hoc_Sau_DDU1231</w:t>
               <w:br/>
@@ -183,16 +264,9 @@
         </w:tc>
       </w:tr>
     </w:tbl>
-    <w:p/>
-    <w:p/>
-    <w:p/>
-    <w:p/>
-    <w:p/>
-    <w:p/>
-    <w:p/>
-    <w:p/>
     <w:p>
       <w:pPr>
+        <w:spacing w:before="2200" w:after="0" w:line="240" w:lineRule="auto"/>
         <w:jc w:val="center"/>
       </w:pPr>
       <w:r>
@@ -201,13 +275,26 @@
           <w:i/>
           <w:sz w:val="26"/>
         </w:rPr>
-        <w:t>Tháng 10 năm 2026</w:t>
+        <w:t>TP. Hồ Chí Minh, tháng 10 năm 2026</w:t>
       </w:r>
     </w:p>
     <w:p>
-      <w:r>
-        <w:br w:type="page"/>
-      </w:r>
+      <w:pPr>
+        <w:sectPr>
+          <w:footerReference w:type="default" r:id="rId9"/>
+          <w:pgSz w:w="11906" w:h="16838"/>
+          <w:pgMar w:top="1134" w:right="1134" w:bottom="1134" w:left="1417" w:header="720" w:footer="720" w:gutter="0"/>
+          <w:pgBorders w:offsetFrom="page">
+            <w:top w:val="thinThickSmallGap" w:sz="24" w:space="24" w:color="0D47A1"/>
+            <w:left w:val="thinThickSmallGap" w:sz="24" w:space="24" w:color="0D47A1"/>
+            <w:bottom w:val="thinThickSmallGap" w:sz="24" w:space="24" w:color="0D47A1"/>
+            <w:right w:val="thinThickSmallGap" w:sz="24" w:space="24" w:color="0D47A1"/>
+          </w:pgBorders>
+          <w:cols w:space="720"/>
+          <w:titlePg/>
+          <w:docGrid w:linePitch="360"/>
+        </w:sectPr>
+      </w:pPr>
     </w:p>
     <w:p>
       <w:pPr>
@@ -4005,7 +4092,7 @@
         <w:drawing>
           <wp:inline xmlns:a="http://schemas.openxmlformats.org/drawingml/2006/main" xmlns:pic="http://schemas.openxmlformats.org/drawingml/2006/picture">
             <wp:extent cx="5760000" cy="2629140"/>
-            <wp:docPr id="1" name="Picture 1"/>
+            <wp:docPr id="2" name="Picture 2"/>
             <wp:cNvGraphicFramePr>
               <a:graphicFrameLocks noChangeAspect="1"/>
             </wp:cNvGraphicFramePr>
@@ -4017,7 +4104,7 @@
                     <pic:cNvPicPr/>
                   </pic:nvPicPr>
                   <pic:blipFill>
-                    <a:blip r:embed="rId10"/>
+                    <a:blip r:embed="rId11"/>
                     <a:stretch>
                       <a:fillRect/>
                     </a:stretch>
@@ -4130,7 +4217,7 @@
         <w:drawing>
           <wp:inline xmlns:a="http://schemas.openxmlformats.org/drawingml/2006/main" xmlns:pic="http://schemas.openxmlformats.org/drawingml/2006/picture">
             <wp:extent cx="5400000" cy="3075497"/>
-            <wp:docPr id="2" name="Picture 2"/>
+            <wp:docPr id="3" name="Picture 3"/>
             <wp:cNvGraphicFramePr>
               <a:graphicFrameLocks noChangeAspect="1"/>
             </wp:cNvGraphicFramePr>
@@ -4142,7 +4229,7 @@
                     <pic:cNvPicPr/>
                   </pic:nvPicPr>
                   <pic:blipFill>
-                    <a:blip r:embed="rId11"/>
+                    <a:blip r:embed="rId12"/>
                     <a:stretch>
                       <a:fillRect/>
                     </a:stretch>
@@ -15762,7 +15849,7 @@
         <w:drawing>
           <wp:inline xmlns:a="http://schemas.openxmlformats.org/drawingml/2006/main" xmlns:pic="http://schemas.openxmlformats.org/drawingml/2006/picture">
             <wp:extent cx="5760000" cy="2482759"/>
-            <wp:docPr id="3" name="Picture 3"/>
+            <wp:docPr id="4" name="Picture 4"/>
             <wp:cNvGraphicFramePr>
               <a:graphicFrameLocks noChangeAspect="1"/>
             </wp:cNvGraphicFramePr>
@@ -15774,7 +15861,7 @@
                     <pic:cNvPicPr/>
                   </pic:nvPicPr>
                   <pic:blipFill>
-                    <a:blip r:embed="rId12"/>
+                    <a:blip r:embed="rId13"/>
                     <a:stretch>
                       <a:fillRect/>
                     </a:stretch>
@@ -15831,7 +15918,7 @@
         <w:drawing>
           <wp:inline xmlns:a="http://schemas.openxmlformats.org/drawingml/2006/main" xmlns:pic="http://schemas.openxmlformats.org/drawingml/2006/picture">
             <wp:extent cx="5760000" cy="2629140"/>
-            <wp:docPr id="4" name="Picture 4"/>
+            <wp:docPr id="5" name="Picture 5"/>
             <wp:cNvGraphicFramePr>
               <a:graphicFrameLocks noChangeAspect="1"/>
             </wp:cNvGraphicFramePr>
@@ -15843,7 +15930,7 @@
                     <pic:cNvPicPr/>
                   </pic:nvPicPr>
                   <pic:blipFill>
-                    <a:blip r:embed="rId13"/>
+                    <a:blip r:embed="rId14"/>
                     <a:stretch>
                       <a:fillRect/>
                     </a:stretch>
@@ -16252,7 +16339,7 @@
         <w:drawing>
           <wp:inline xmlns:a="http://schemas.openxmlformats.org/drawingml/2006/main" xmlns:pic="http://schemas.openxmlformats.org/drawingml/2006/picture">
             <wp:extent cx="5760000" cy="2481951"/>
-            <wp:docPr id="5" name="Picture 5"/>
+            <wp:docPr id="6" name="Picture 6"/>
             <wp:cNvGraphicFramePr>
               <a:graphicFrameLocks noChangeAspect="1"/>
             </wp:cNvGraphicFramePr>
@@ -16264,7 +16351,7 @@
                     <pic:cNvPicPr/>
                   </pic:nvPicPr>
                   <pic:blipFill>
-                    <a:blip r:embed="rId14"/>
+                    <a:blip r:embed="rId15"/>
                     <a:stretch>
                       <a:fillRect/>
                     </a:stretch>
@@ -16888,7 +16975,7 @@
         <w:drawing>
           <wp:inline xmlns:a="http://schemas.openxmlformats.org/drawingml/2006/main" xmlns:pic="http://schemas.openxmlformats.org/drawingml/2006/picture">
             <wp:extent cx="5760000" cy="2482759"/>
-            <wp:docPr id="6" name="Picture 6"/>
+            <wp:docPr id="7" name="Picture 7"/>
             <wp:cNvGraphicFramePr>
               <a:graphicFrameLocks noChangeAspect="1"/>
             </wp:cNvGraphicFramePr>
@@ -16900,7 +16987,7 @@
                     <pic:cNvPicPr/>
                   </pic:nvPicPr>
                   <pic:blipFill>
-                    <a:blip r:embed="rId15"/>
+                    <a:blip r:embed="rId16"/>
                     <a:stretch>
                       <a:fillRect/>
                     </a:stretch>
@@ -17463,7 +17550,7 @@
         <w:drawing>
           <wp:inline xmlns:a="http://schemas.openxmlformats.org/drawingml/2006/main" xmlns:pic="http://schemas.openxmlformats.org/drawingml/2006/picture">
             <wp:extent cx="5940000" cy="3111279"/>
-            <wp:docPr id="7" name="Picture 7"/>
+            <wp:docPr id="8" name="Picture 8"/>
             <wp:cNvGraphicFramePr>
               <a:graphicFrameLocks noChangeAspect="1"/>
             </wp:cNvGraphicFramePr>
@@ -17475,7 +17562,7 @@
                     <pic:cNvPicPr/>
                   </pic:nvPicPr>
                   <pic:blipFill>
-                    <a:blip r:embed="rId16"/>
+                    <a:blip r:embed="rId17"/>
                     <a:stretch>
                       <a:fillRect/>
                     </a:stretch>
@@ -20913,9 +21000,9 @@
     </w:tbl>
     <w:p/>
     <w:sectPr>
-      <w:footerReference w:type="default" r:id="rId9"/>
       <w:pgSz w:w="11906" w:h="16838"/>
       <w:pgMar w:top="1134" w:right="1134" w:bottom="1134" w:left="1417" w:header="720" w:footer="720" w:gutter="0"/>
+      <w:pgNumType w:start="1"/>
       <w:cols w:space="720"/>
       <w:docGrid w:linePitch="360"/>
     </w:sectPr>

</xml_diff>